<commit_message>
📄 DOCX firmado: AENA740918271 - 8/5/2026, 9:00:52 p.m.
</commit_message>
<xml_diff>
--- a/data/declaraciones/signed/AENA740918271.docx
+++ b/data/declaraciones/signed/AENA740918271.docx
@@ -4157,63 +4157,217 @@
     </w:p>
     <w:p>
       <w:pPr>
-        <w:pStyle w:val="Textoindependiente"/>
-        <w:spacing w:before="3"/>
-      </w:pPr>
-    </w:p>
-    <w:p>
-      <w:pPr>
-        <w:pStyle w:val="Textoindependiente"/>
-        <w:spacing w:line="475" w:lineRule="auto"/>
-        <w:ind w:left="260" w:right="4497"/>
-      </w:pPr>
-      <w:r>
-        <w:t>Nombre</w:t>
-      </w:r>
-      <w:r>
-        <w:rPr>
-          <w:spacing w:val="-8"/>
-        </w:rPr>
-        <w:t xml:space="preserve"> </w:t>
-      </w:r>
-      <w:r>
-        <w:t>del</w:t>
-      </w:r>
-      <w:r>
-        <w:rPr>
-          <w:spacing w:val="-8"/>
-        </w:rPr>
-        <w:t xml:space="preserve"> </w:t>
-      </w:r>
-      <w:r>
-        <w:t>Proveedor</w:t>
-      </w:r>
-      <w:r>
-        <w:rPr>
-          <w:spacing w:val="-8"/>
-        </w:rPr>
-        <w:t xml:space="preserve"> </w:t>
-      </w:r>
-      <w:r>
-        <w:t>o</w:t>
-      </w:r>
-      <w:r>
-        <w:rPr>
-          <w:spacing w:val="-8"/>
-        </w:rPr>
-        <w:t xml:space="preserve"> </w:t>
-      </w:r>
-      <w:r>
-        <w:t>Razón</w:t>
-      </w:r>
-      <w:r>
-        <w:rPr>
-          <w:spacing w:val="-8"/>
-        </w:rPr>
-        <w:t xml:space="preserve"> </w:t>
-      </w:r>
-      <w:r>
-        <w:t xml:space="preserve">Social: Nombre del Representante Legal: </w:t>
+        <w:spacing w:before="309"/>
+        <w:ind w:right="4"/>
+        <w:jc w:val="both"/>
+        <w:rPr>
+          <w:lang w:val="es-MX"/>
+        </w:rPr>
+      </w:pPr>
+      <w:r>
+        <w:rPr>
+          <w:lang w:val="es-MX"/>
+        </w:rPr>
+        <w:t xml:space="preserve">Nombre del Proveedor o Razón Social: </w:t>
+      </w:r>
+    </w:p>
+    <w:p>
+      <w:pPr>
+        <w:spacing w:before="309"/>
+        <w:ind w:right="4"/>
+        <w:jc w:val="both"/>
+        <w:rPr>
+          <w:lang w:val="es-MX"/>
+        </w:rPr>
+      </w:pPr>
+      <w:r>
+        <w:rPr>
+          <w:lang w:val="es-MX"/>
+        </w:rPr>
+        <w:t xml:space="preserve">ALEJANDRO ALEGRE NAJERA</w:t>
+      </w:r>
+      <w:proofErr w:type="spellStart"/>
+      <w:r>
+        <w:rPr>
+          <w:lang w:val="es-MX"/>
+        </w:rPr>
+        <w:t/>
+      </w:r>
+      <w:proofErr w:type="spellEnd"/>
+      <w:r>
+        <w:rPr>
+          <w:lang w:val="es-MX"/>
+        </w:rPr>
+        <w:t/>
+      </w:r>
+    </w:p>
+    <w:p>
+      <w:pPr>
+        <w:spacing w:before="309"/>
+        <w:ind w:right="4"/>
+        <w:jc w:val="both"/>
+        <w:rPr>
+          <w:lang w:val="es-MX"/>
+        </w:rPr>
+      </w:pPr>
+      <w:r>
+        <w:rPr>
+          <w:lang w:val="es-MX"/>
+        </w:rPr>
+        <w:t>Nombre del Representante Legal:</w:t>
+      </w:r>
+    </w:p>
+    <w:p>
+      <w:pPr>
+        <w:spacing w:before="309"/>
+        <w:ind w:right="4"/>
+        <w:jc w:val="both"/>
+        <w:rPr>
+          <w:lang w:val="es-MX"/>
+        </w:rPr>
+      </w:pPr>
+      <w:r>
+        <w:rPr>
+          <w:lang w:val="es-MX"/>
+        </w:rPr>
+        <w:t xml:space="preserve">Alejandro Alegre Najera</w:t>
+      </w:r>
+      <w:proofErr w:type="spellStart"/>
+      <w:r>
+        <w:rPr>
+          <w:lang w:val="es-MX"/>
+        </w:rPr>
+        <w:t/>
+      </w:r>
+      <w:proofErr w:type="spellEnd"/>
+      <w:r>
+        <w:rPr>
+          <w:lang w:val="es-MX"/>
+        </w:rPr>
+        <w:t/>
+      </w:r>
+    </w:p>
+    <w:p>
+      <w:pPr>
+        <w:spacing w:before="309"/>
+        <w:ind w:right="4"/>
+        <w:jc w:val="both"/>
+        <w:rPr>
+          <w:lang w:val="es-MX"/>
+        </w:rPr>
+      </w:pPr>
+      <w:r>
+        <w:rPr>
+          <w:lang w:val="es-MX"/>
+        </w:rPr>
+        <w:t>Firma de Proveedor o Representante Legal:</w:t>
+      </w:r>
+    </w:p>
+    <w:p>
+      <w:pPr>
+        <w:spacing w:before="309"/>
+        <w:ind w:right="4"/>
+        <w:jc w:val="both"/>
+        <w:rPr>
+          <w:lang w:val="es-MX"/>
+        </w:rPr>
+      </w:pPr>
+      <w:r>
+        <w:rPr>
+          <w:lang w:val="es-MX"/>
+        </w:rPr>
+        <w:drawing>
+          <wp:inline distT="0" distB="0" distL="0" distR="0">
+            <wp:extent cx="1428750" cy="571500"/>
+            <wp:effectExtent l="0" t="0" r="0" b="0"/>
+            <wp:docPr id="2" name="Image 2" descr="image"/>
+            <wp:cNvGraphicFramePr>
+              <a:graphicFrameLocks xmlns:a="http://schemas.openxmlformats.org/drawingml/2006/main" noChangeAspect="1"/>
+            </wp:cNvGraphicFramePr>
+            <a:graphic xmlns:a="http://schemas.openxmlformats.org/drawingml/2006/main">
+              <a:graphicData uri="http://schemas.openxmlformats.org/drawingml/2006/picture">
+                <pic:pic xmlns:pic="http://schemas.openxmlformats.org/drawingml/2006/picture">
+                  <pic:nvPicPr>
+                    <pic:cNvPr id="0" name="Picture 1" descr="image"/>
+                    <pic:cNvPicPr>
+                      <a:picLocks noChangeAspect="1" noChangeArrowheads="1"/>
+                    </pic:cNvPicPr>
+                  </pic:nvPicPr>
+                  <pic:blipFill>
+                    <a:blip r:embed="rId9">
+                      <a:extLst>
+                        <a:ext uri="{28A0092B-C50C-407E-A947-70E740481C1C}">
+                          <a14:useLocalDpi xmlns:a14="http://schemas.microsoft.com/office/drawing/2010/main" val="0"/>
+                        </a:ext>
+                      </a:extLst>
+                    </a:blip>
+                    <a:srcRect/>
+                    <a:stretch>
+                      <a:fillRect/>
+                    </a:stretch>
+                  </pic:blipFill>
+                  <pic:spPr bwMode="auto">
+                    <a:xfrm>
+                      <a:off x="0" y="0"/>
+                      <a:ext cx="1428750" cy="571500"/>
+                    </a:xfrm>
+                    <a:prstGeom prst="rect">
+                      <a:avLst/>
+                    </a:prstGeom>
+                    <a:noFill/>
+                    <a:ln>
+                      <a:noFill/>
+                    </a:ln>
+                  </pic:spPr>
+                </pic:pic>
+              </a:graphicData>
+            </a:graphic>
+          </wp:inline>
+        </w:drawing>
+      </w:r>
+      <w:proofErr w:type="spellStart"/>
+      <w:r>
+        <w:rPr>
+          <w:lang w:val="es-MX"/>
+        </w:rPr>
+        <w:t/>
+      </w:r>
+      <w:proofErr w:type="spellEnd"/>
+      <w:r>
+        <w:rPr>
+          <w:lang w:val="es-MX"/>
+        </w:rPr>
+        <w:t/>
+      </w:r>
+    </w:p>
+    <w:p>
+      <w:pPr>
+        <w:spacing w:before="309"/>
+        <w:ind w:right="4"/>
+        <w:jc w:val="both"/>
+        <w:rPr>
+          <w:lang w:val="es-MX"/>
+        </w:rPr>
+      </w:pPr>
+      <w:r>
+        <w:rPr>
+          <w:lang w:val="es-MX"/>
+        </w:rPr>
+        <w:t xml:space="preserve">Fecha: 08 de mayo de 2026</w:t>
+      </w:r>
+      <w:proofErr w:type="spellStart"/>
+      <w:r>
+        <w:rPr>
+          <w:lang w:val="es-MX"/>
+        </w:rPr>
+        <w:t/>
+      </w:r>
+      <w:proofErr w:type="spellEnd"/>
+      <w:r>
+        <w:rPr>
+          <w:lang w:val="es-MX"/>
+        </w:rPr>
+        <w:t/>
       </w:r>
     </w:p>
     <w:p>
@@ -4222,66 +4376,19 @@
         <w:spacing w:before="214"/>
         <w:ind w:left="260"/>
         <w:rPr>
+          <w:spacing w:val="-2"/>
+        </w:rPr>
+      </w:pPr>
+    </w:p>
+    <w:p>
+      <w:pPr>
+        <w:pStyle w:val="Textoindependiente"/>
+        <w:spacing w:before="214"/>
+        <w:rPr>
           <w:sz w:val="17"/>
-        </w:rPr>
-      </w:pPr>
-      <w:r>
-        <w:t>Firma</w:t>
-      </w:r>
-      <w:r>
-        <w:rPr>
-          <w:spacing w:val="-4"/>
-        </w:rPr>
-        <w:t xml:space="preserve"> </w:t>
-      </w:r>
-      <w:r>
-        <w:t>de</w:t>
-      </w:r>
-      <w:r>
-        <w:rPr>
-          <w:spacing w:val="-2"/>
-        </w:rPr>
-        <w:t xml:space="preserve"> </w:t>
-      </w:r>
-      <w:r>
-        <w:t>Proveedor</w:t>
-      </w:r>
-      <w:r>
-        <w:rPr>
-          <w:spacing w:val="-4"/>
-        </w:rPr>
-        <w:t xml:space="preserve"> </w:t>
-      </w:r>
-      <w:r>
-        <w:t>o</w:t>
-      </w:r>
-      <w:r>
-        <w:rPr>
-          <w:spacing w:val="-2"/>
-        </w:rPr>
-        <w:t xml:space="preserve"> </w:t>
-      </w:r>
-      <w:r>
-        <w:t>Representante</w:t>
-      </w:r>
-      <w:r>
-        <w:rPr>
-          <w:spacing w:val="-3"/>
-        </w:rPr>
-        <w:t xml:space="preserve"> </w:t>
-      </w:r>
-      <w:r>
-        <w:rPr>
-          <w:spacing w:val="-2"/>
-        </w:rPr>
-        <w:t>Lega</w:t>
-      </w:r>
-      <w:r>
-        <w:rPr>
-          <w:spacing w:val="-2"/>
-        </w:rPr>
-        <w:t>l:</w:t>
-      </w:r>
+          <w:lang w:val="es-MX"/>
+        </w:rPr>
+      </w:pPr>
       <w:r>
         <w:rPr>
           <w:sz w:val="17"/>
@@ -4824,7 +4931,6 @@
   <w:style w:type="character" w:default="1" w:styleId="Fuentedeprrafopredeter">
     <w:name w:val="Default Paragraph Font"/>
     <w:uiPriority w:val="1"/>
-    <w:semiHidden/>
     <w:unhideWhenUsed/>
   </w:style>
   <w:style w:type="table" w:default="1" w:styleId="Tablanormal">

</xml_diff>